<commit_message>
Update repository link and name
</commit_message>
<xml_diff>
--- a/docs/Clinical_Trial_Termination_Project_Scoping.docx
+++ b/docs/Clinical_Trial_Termination_Project_Scoping.docx
@@ -1104,7 +1104,7 @@
         <w:t>Repository link:</w:t>
       </w:r>
       <w:r>
-        <w:t xml:space="preserve"> https://github.com/PavanchytanyaD/clinical-trial-termination (public)</w:t>
+        <w:t xml:space="preserve"> https://github.com/PavanchytanyaD/clinical-trial-termination-prediction (public)</w:t>
       </w:r>
     </w:p>
     <w:p>
@@ -1124,7 +1124,7 @@
           <w:rFonts w:ascii="Courier New" w:hAnsi="Courier New"/>
           <w:sz w:val="19"/>
         </w:rPr>
-        <w:t>clinical-trial-termination/</w:t>
+        <w:t>clinical-trial-termination-prediction/</w:t>
         <w:br/>
         <w:t>|- data/        raw and processed data (DVC-tracked)</w:t>
         <w:br/>

</xml_diff>